<commit_message>
docs(decision): legacy preservation is now PAID; memorial + per-child copies; Time Capsule parked
Owner reversed two 2026-07-05 Phase 3 locks after each conflict was surfaced
and reaffirmed:

1. Preservation is PAID per holding account (retires 'free forever, monetize
   enhancement not preservation'). Price/period/grace/lapse-behaviour unset.
2. Memorial node stays canonical and unabsorbed AND each direct-line child
   holds a separately-billed copy (the inverse of lock #6, never designed).
3. Time Capsule videos noted and parked; analysis preserved in design section 7.

The free-preservation promise was stated IN WRITING to PH counsel. The brief is
corrected in place, the .docx mirror regenerated, and two priority questions
added (Q8 deletion-for-non-payment, Q9 fan-out erasure). It must be re-sent
before counsel answers.

Nothing built - DPIA R-05 stays HIGH and counsel-first.

Co-Authored-By: Claude Opus 5 <noreply@anthropic.com>
</commit_message>
<xml_diff>
--- a/03_Strategy/Phase3_Minors_and_Legacy_Counsel_Brief_2026-07-05.docx
+++ b/03_Strategy/Phase3_Minors_and_Legacy_Counsel_Brief_2026-07-05.docx
@@ -2,7 +2,7 @@
 <file path=word/document.xml><?xml version="1.0" encoding="utf-8"?>
 <w:document xmlns:w="http://schemas.openxmlformats.org/wordprocessingml/2006/main" xmlns:m="http://schemas.openxmlformats.org/officeDocument/2006/math" xmlns:r="http://schemas.openxmlformats.org/officeDocument/2006/relationships" xmlns:o="urn:schemas-microsoft-com:office:office" xmlns:v="urn:schemas-microsoft-com:vml" xmlns:w10="urn:schemas-microsoft-com:office:word" xmlns:a="http://schemas.openxmlformats.org/drawingml/2006/main" xmlns:pic="http://schemas.openxmlformats.org/drawingml/2006/picture" xmlns:wp="http://schemas.openxmlformats.org/drawingml/2006/wordprocessingDrawing">
   <w:body>
-    <w:bookmarkStart w:id="15" w:name="X2ced72f9a1495cd18c40fe840781e868d427d83"/>
+    <w:bookmarkStart w:id="16" w:name="X2ced72f9a1495cd18c40fe840781e868d427d83"/>
     <w:p>
       <w:pPr>
         <w:pStyle w:val="Heading1"/>
@@ -87,7 +87,7 @@
         <w:t xml:space="preserve"> </w:t>
       </w:r>
       <w:r>
-        <w:t xml:space="preserve">Claire E. Buanhog</w:t>
+        <w:t xml:space="preserve">Indalecio Sacdalan Casasola II</w:t>
       </w:r>
       <w:r>
         <w:t xml:space="preserve"> </w:t>
@@ -168,6 +168,190 @@
       </w:r>
       <w:r>
         <w:t xml:space="preserve">. Read time: ~10 minutes.</w:t>
+      </w:r>
+    </w:p>
+    <w:p>
+      <w:pPr>
+        <w:pStyle w:val="Heading2"/>
+      </w:pPr>
+      <w:bookmarkStart w:id="9" w:name="Xa938a2682b951b2a5b75a431cf614d29b82463f"/>
+      <w:r>
+        <w:t xml:space="preserve">🔴 CORRECTION — 2026-07-30 · THE COMMERCIAL MODEL CHANGED. RE-ISSUE BEFORE COUNSEL ANSWERS.</w:t>
+      </w:r>
+      <w:bookmarkEnd w:id="9"/>
+    </w:p>
+    <w:p>
+      <w:pPr>
+        <w:pStyle w:val="BlockText"/>
+      </w:pPr>
+      <w:r>
+        <w:rPr>
+          <w:b/>
+          <w:bCs/>
+        </w:rPr>
+        <w:t xml:space="preserve">This brief as originally written told you that preservation would be free.</w:t>
+      </w:r>
+      <w:r>
+        <w:t xml:space="preserve"> </w:t>
+      </w:r>
+      <w:r>
+        <w:t xml:space="preserve">That is no longer</w:t>
+      </w:r>
+      <w:r>
+        <w:t xml:space="preserve"> </w:t>
+      </w:r>
+      <w:r>
+        <w:t xml:space="preserve">our model, and we are correcting it rather than letting you answer against a design we no longer</w:t>
+      </w:r>
+      <w:r>
+        <w:t xml:space="preserve"> </w:t>
+      </w:r>
+      <w:r>
+        <w:t xml:space="preserve">intend to build. Two changes:</w:t>
+      </w:r>
+    </w:p>
+    <w:p>
+      <w:pPr>
+        <w:pStyle w:val="Compact"/>
+        <w:numPr>
+          <w:ilvl w:val="0"/>
+          <w:numId w:val="1001"/>
+        </w:numPr>
+      </w:pPr>
+      <w:r>
+        <w:rPr>
+          <w:b/>
+          <w:bCs/>
+        </w:rPr>
+        <w:t xml:space="preserve">Preservation is now a PAID, RECURRING service (reversing § 3.4 and § 5).</w:t>
+      </w:r>
+      <w:r>
+        <w:t xml:space="preserve"> </w:t>
+      </w:r>
+      <w:r>
+        <w:t xml:space="preserve">Each account that</w:t>
+      </w:r>
+      <w:r>
+        <w:t xml:space="preserve"> </w:t>
+      </w:r>
+      <w:r>
+        <w:t xml:space="preserve">holds a deceased relative’s memories pays to keep them. If payment lapses, that account’s</w:t>
+      </w:r>
+      <w:r>
+        <w:t xml:space="preserve"> </w:t>
+      </w:r>
+      <w:r>
+        <w:t xml:space="preserve">access to those memories ends. We are</w:t>
+      </w:r>
+      <w:r>
+        <w:t xml:space="preserve"> </w:t>
+      </w:r>
+      <w:r>
+        <w:rPr>
+          <w:b/>
+          <w:bCs/>
+        </w:rPr>
+        <w:t xml:space="preserve">no longer</w:t>
+      </w:r>
+      <w:r>
+        <w:t xml:space="preserve"> </w:t>
+      </w:r>
+      <w:r>
+        <w:t xml:space="preserve">promising free-forever preservation.</w:t>
+      </w:r>
+    </w:p>
+    <w:p>
+      <w:pPr>
+        <w:pStyle w:val="Compact"/>
+        <w:numPr>
+          <w:ilvl w:val="0"/>
+          <w:numId w:val="1001"/>
+        </w:numPr>
+      </w:pPr>
+      <w:r>
+        <w:rPr>
+          <w:b/>
+          <w:bCs/>
+        </w:rPr>
+        <w:t xml:space="preserve">One deceased person’s memories may be held by SEVERAL descendants at once</w:t>
+      </w:r>
+      <w:r>
+        <w:t xml:space="preserve"> </w:t>
+      </w:r>
+      <w:r>
+        <w:t xml:space="preserve">— a canonical</w:t>
+      </w:r>
+      <w:r>
+        <w:t xml:space="preserve"> </w:t>
+      </w:r>
+      <w:r>
+        <w:t xml:space="preserve">memorial page under the deceased’s own name,</w:t>
+      </w:r>
+      <w:r>
+        <w:t xml:space="preserve"> </w:t>
+      </w:r>
+      <w:r>
+        <w:rPr>
+          <w:b/>
+          <w:bCs/>
+        </w:rPr>
+        <w:t xml:space="preserve">plus</w:t>
+      </w:r>
+      <w:r>
+        <w:t xml:space="preserve"> </w:t>
+      </w:r>
+      <w:r>
+        <w:t xml:space="preserve">a separately-billed personal copy in each</w:t>
+      </w:r>
+      <w:r>
+        <w:t xml:space="preserve"> </w:t>
+      </w:r>
+      <w:r>
+        <w:t xml:space="preserve">direct-line child’s account.</w:t>
+      </w:r>
+    </w:p>
+    <w:p>
+      <w:pPr>
+        <w:pStyle w:val="BlockText"/>
+      </w:pPr>
+      <w:r>
+        <w:t xml:space="preserve">Both changes create legal questions the original brief did not ask.</w:t>
+      </w:r>
+      <w:r>
+        <w:t xml:space="preserve"> </w:t>
+      </w:r>
+      <w:r>
+        <w:rPr>
+          <w:b/>
+          <w:bCs/>
+        </w:rPr>
+        <w:t xml:space="preserve">They are added as § 4</w:t>
+      </w:r>
+      <w:r>
+        <w:rPr>
+          <w:b/>
+          <w:bCs/>
+        </w:rPr>
+        <w:t xml:space="preserve"> </w:t>
+      </w:r>
+      <w:r>
+        <w:rPr>
+          <w:b/>
+          <w:bCs/>
+        </w:rPr>
+        <w:t xml:space="preserve">questions 8 and 9 and are, in our view, now the most important questions in this brief.</w:t>
+      </w:r>
+      <w:r>
+        <w:t xml:space="preserve"> </w:t>
+      </w:r>
+      <w:r>
+        <w:t xml:space="preserve">Please answer against this corrected version. Sections § 3.4 and § 5 are struck through below;</w:t>
+      </w:r>
+      <w:r>
+        <w:t xml:space="preserve"> </w:t>
+      </w:r>
+      <w:r>
+        <w:t xml:space="preserve">the rest of the brief is unchanged and still accurate.</w:t>
       </w:r>
     </w:p>
     <w:p>
@@ -177,7 +361,7 @@
         </w:pict>
       </w:r>
     </w:p>
-    <w:bookmarkStart w:id="9" w:name="what-phase-3-does-one-paragraph"/>
+    <w:bookmarkStart w:id="10" w:name="what-phase-3-does-one-paragraph"/>
     <w:p>
       <w:pPr>
         <w:pStyle w:val="Heading2"/>
@@ -304,27 +488,104 @@
         <w:t xml:space="preserve"> </w:t>
       </w:r>
       <w:r>
-        <w:t xml:space="preserve">(child, then grandchild) to a designated heir, or become a memorial. The intent is that</w:t>
-      </w:r>
-      <w:r>
-        <w:t xml:space="preserve"> </w:t>
-      </w:r>
-      <w:r>
-        <w:rPr>
-          <w:b/>
-          <w:bCs/>
+        <w:t xml:space="preserve">(child, then grandchild) to a designated heir, or become a memorial.</w:t>
+      </w:r>
+      <w:r>
+        <w:t xml:space="preserve"> </w:t>
+      </w:r>
+      <w:r>
+        <w:rPr>
+          <w:i/>
+          <w:iCs/>
+          <w:strike/>
+        </w:rPr>
+        <w:t xml:space="preserve">The intent is that</w:t>
+      </w:r>
+      <w:r>
+        <w:rPr>
+          <w:i/>
+          <w:iCs/>
+          <w:strike/>
+        </w:rPr>
+        <w:t xml:space="preserve"> </w:t>
+      </w:r>
+      <w:r>
+        <w:rPr>
+          <w:b/>
+          <w:bCs/>
+          <w:i/>
+          <w:iCs/>
+          <w:strike/>
         </w:rPr>
         <w:t xml:space="preserve">memories are never lost</w:t>
       </w:r>
       <w:r>
-        <w:t xml:space="preserve"> </w:t>
-      </w:r>
-      <w:r>
+        <w:rPr>
+          <w:i/>
+          <w:iCs/>
+          <w:strike/>
+        </w:rPr>
+        <w:t xml:space="preserve"> </w:t>
+      </w:r>
+      <w:r>
+        <w:rPr>
+          <w:i/>
+          <w:iCs/>
+          <w:strike/>
+        </w:rPr>
         <w:t xml:space="preserve">and can be passed on.</w:t>
       </w:r>
-    </w:p>
-    <w:bookmarkEnd w:id="9"/>
-    <w:bookmarkStart w:id="10" w:name="what-data-is-involved"/>
+      <w:r>
+        <w:t xml:space="preserve"> </w:t>
+      </w:r>
+      <w:r>
+        <w:t xml:space="preserve">🔴</w:t>
+      </w:r>
+      <w:r>
+        <w:t xml:space="preserve"> </w:t>
+      </w:r>
+      <w:r>
+        <w:rPr>
+          <w:b/>
+          <w:bCs/>
+        </w:rPr>
+        <w:t xml:space="preserve">Corrected 2026-07-30:</w:t>
+      </w:r>
+      <w:r>
+        <w:t xml:space="preserve"> </w:t>
+      </w:r>
+      <w:r>
+        <w:t xml:space="preserve">the intent is that memories</w:t>
+      </w:r>
+      <w:r>
+        <w:t xml:space="preserve"> </w:t>
+      </w:r>
+      <w:r>
+        <w:rPr>
+          <w:b/>
+          <w:bCs/>
+        </w:rPr>
+        <w:t xml:space="preserve">can be passed on</w:t>
+      </w:r>
+      <w:r>
+        <w:t xml:space="preserve">; they are</w:t>
+      </w:r>
+      <w:r>
+        <w:t xml:space="preserve"> </w:t>
+      </w:r>
+      <w:r>
+        <w:rPr>
+          <w:b/>
+          <w:bCs/>
+        </w:rPr>
+        <w:t xml:space="preserve">no longer promised to be never lost</w:t>
+      </w:r>
+      <w:r>
+        <w:t xml:space="preserve">, because preservation is now a paid recurring service that ends on lapse (§ 3.4 as corrected, and § 4 Q8).</w:t>
+      </w:r>
+    </w:p>
+    <w:bookmarkEnd w:id="10"/>
+    <w:bookmarkStart w:id="11" w:name="what-data-is-involved"/>
     <w:p>
       <w:pPr>
         <w:pStyle w:val="Heading2"/>
@@ -531,8 +792,8 @@
         <w:t xml:space="preserve">No biometric data is used (same as Phase 2 — association is by manual tag / QR / confirmed identity only, never cross-event face recognition).</w:t>
       </w:r>
     </w:p>
-    <w:bookmarkEnd w:id="10"/>
-    <w:bookmarkStart w:id="11" w:name="X7376126b5e31752b498780c27ccabd1fe4423bb"/>
+    <w:bookmarkEnd w:id="11"/>
+    <w:bookmarkStart w:id="12" w:name="X7376126b5e31752b498780c27ccabd1fe4423bb"/>
     <w:p>
       <w:pPr>
         <w:pStyle w:val="Heading2"/>
@@ -543,451 +804,6 @@
     </w:p>
     <w:p>
       <w:pPr>
-        <w:pStyle w:val="Compact"/>
-        <w:numPr>
-          <w:ilvl w:val="0"/>
-          <w:numId w:val="1001"/>
-        </w:numPr>
-      </w:pPr>
-      <w:r>
-        <w:rPr>
-          <w:b/>
-          <w:bCs/>
-        </w:rPr>
-        <w:t xml:space="preserve">Ownership transfers at age of majority (18).</w:t>
-      </w:r>
-      <w:r>
-        <w:t xml:space="preserve"> </w:t>
-      </w:r>
-      <w:r>
-        <w:t xml:space="preserve">The guardian is the lawful decision-maker for the child’s data until 18; at 18 ownership + consent authority transfer to the person. We are</w:t>
-      </w:r>
-      <w:r>
-        <w:t xml:space="preserve"> </w:t>
-      </w:r>
-      <w:r>
-        <w:rPr>
-          <w:b/>
-          <w:bCs/>
-        </w:rPr>
-        <w:t xml:space="preserve">not</w:t>
-      </w:r>
-      <w:r>
-        <w:t xml:space="preserve"> </w:t>
-      </w:r>
-      <w:r>
-        <w:t xml:space="preserve">promising any sub-18 ownership transfer.</w:t>
-      </w:r>
-      <w:r>
-        <w:t xml:space="preserve"> </w:t>
-      </w:r>
-      <w:r>
-        <w:rPr>
-          <w:i/>
-          <w:iCs/>
-        </w:rPr>
-        <w:t xml:space="preserve">(We considered an optional teen</w:t>
-      </w:r>
-      <w:r>
-        <w:rPr>
-          <w:i/>
-          <w:iCs/>
-        </w:rPr>
-        <w:t xml:space="preserve"> </w:t>
-      </w:r>
-      <w:r>
-        <w:rPr>
-          <w:i/>
-          <w:iCs/>
-        </w:rPr>
-        <w:t xml:space="preserve">“assisted access”</w:t>
-      </w:r>
-      <w:r>
-        <w:rPr>
-          <w:i/>
-          <w:iCs/>
-        </w:rPr>
-        <w:t xml:space="preserve"> </w:t>
-      </w:r>
-      <w:r>
-        <w:rPr>
-          <w:i/>
-          <w:iCs/>
-        </w:rPr>
-        <w:t xml:space="preserve">— view-only use under guardian oversight, guardian keeps ownership/consent — see Q2.)</w:t>
-      </w:r>
-    </w:p>
-    <w:p>
-      <w:pPr>
-        <w:pStyle w:val="Compact"/>
-        <w:numPr>
-          <w:ilvl w:val="0"/>
-          <w:numId w:val="1001"/>
-        </w:numPr>
-      </w:pPr>
-      <w:r>
-        <w:rPr>
-          <w:b/>
-          <w:bCs/>
-        </w:rPr>
-        <w:t xml:space="preserve">Guardian is steward until majority.</w:t>
-      </w:r>
-      <w:r>
-        <w:t xml:space="preserve"> </w:t>
-      </w:r>
-      <w:r>
-        <w:t xml:space="preserve">Memories accrue on the child’s node throughout 0–18, managed by the guardian.</w:t>
-      </w:r>
-    </w:p>
-    <w:p>
-      <w:pPr>
-        <w:pStyle w:val="Compact"/>
-        <w:numPr>
-          <w:ilvl w:val="0"/>
-          <w:numId w:val="1001"/>
-        </w:numPr>
-      </w:pPr>
-      <w:r>
-        <w:rPr>
-          <w:b/>
-          <w:bCs/>
-        </w:rPr>
-        <w:t xml:space="preserve">Legacy passes down the DIRECT LINE only</w:t>
-      </w:r>
-      <w:r>
-        <w:t xml:space="preserve"> </w:t>
-      </w:r>
-      <w:r>
-        <w:t xml:space="preserve">— child → grandchild → … — never sideways (no siblings/cousins), using confirmed parent/child relationships.</w:t>
-      </w:r>
-    </w:p>
-    <w:p>
-      <w:pPr>
-        <w:pStyle w:val="Compact"/>
-        <w:numPr>
-          <w:ilvl w:val="0"/>
-          <w:numId w:val="1001"/>
-        </w:numPr>
-      </w:pPr>
-      <w:r>
-        <w:rPr>
-          <w:b/>
-          <w:bCs/>
-        </w:rPr>
-        <w:t xml:space="preserve">Preservation is free; we only charge for enhancement.</w:t>
-      </w:r>
-      <w:r>
-        <w:t xml:space="preserve"> </w:t>
-      </w:r>
-      <w:r>
-        <w:t xml:space="preserve">We will</w:t>
-      </w:r>
-      <w:r>
-        <w:t xml:space="preserve"> </w:t>
-      </w:r>
-      <w:r>
-        <w:rPr>
-          <w:b/>
-          <w:bCs/>
-        </w:rPr>
-        <w:t xml:space="preserve">not</w:t>
-      </w:r>
-      <w:r>
-        <w:t xml:space="preserve"> </w:t>
-      </w:r>
-      <w:r>
-        <w:t xml:space="preserve">charge a fee to prevent loss of a deceased person’s memories. (A premium</w:t>
-      </w:r>
-      <w:r>
-        <w:t xml:space="preserve"> </w:t>
-      </w:r>
-      <w:r>
-        <w:t xml:space="preserve">“vault”</w:t>
-      </w:r>
-      <w:r>
-        <w:t xml:space="preserve"> </w:t>
-      </w:r>
-      <w:r>
-        <w:t xml:space="preserve">of</w:t>
-      </w:r>
-      <w:r>
-        <w:t xml:space="preserve"> </w:t>
-      </w:r>
-      <w:r>
-        <w:rPr>
-          <w:i/>
-          <w:iCs/>
-        </w:rPr>
-        <w:t xml:space="preserve">extra</w:t>
-      </w:r>
-      <w:r>
-        <w:t xml:space="preserve"> </w:t>
-      </w:r>
-      <w:r>
-        <w:t xml:space="preserve">features may be paid — not relevant to this review.)</w:t>
-      </w:r>
-    </w:p>
-    <w:bookmarkEnd w:id="11"/>
-    <w:bookmarkStart w:id="12" w:name="the-specific-questions-we-need-answered"/>
-    <w:p>
-      <w:pPr>
-        <w:pStyle w:val="Heading2"/>
-      </w:pPr>
-      <w:r>
-        <w:t xml:space="preserve">4. The specific questions we need answered</w:t>
-      </w:r>
-    </w:p>
-    <w:p>
-      <w:pPr>
-        <w:pStyle w:val="FirstParagraph"/>
-      </w:pPr>
-      <w:r>
-        <w:rPr>
-          <w:b/>
-          <w:bCs/>
-        </w:rPr>
-        <w:t xml:space="preserve">Minors</w:t>
-      </w:r>
-      <w:r>
-        <w:t xml:space="preserve"> </w:t>
-      </w:r>
-      <w:r>
-        <w:t xml:space="preserve">1.</w:t>
-      </w:r>
-      <w:r>
-        <w:t xml:space="preserve"> </w:t>
-      </w:r>
-      <w:r>
-        <w:rPr>
-          <w:b/>
-          <w:bCs/>
-        </w:rPr>
-        <w:t xml:space="preserve">Guardianship + consent</w:t>
-      </w:r>
-      <w:r>
-        <w:t xml:space="preserve"> </w:t>
-      </w:r>
-      <w:r>
-        <w:t xml:space="preserve">— What standard should we require to prove a person is a child’s parent/legal guardian, and what may a guardian consent to on the child’s behalf regarding this data?</w:t>
-      </w:r>
-      <w:r>
-        <w:t xml:space="preserve"> </w:t>
-      </w:r>
-      <w:r>
-        <w:t xml:space="preserve">2.</w:t>
-      </w:r>
-      <w:r>
-        <w:t xml:space="preserve"> </w:t>
-      </w:r>
-      <w:r>
-        <w:rPr>
-          <w:b/>
-          <w:bCs/>
-        </w:rPr>
-        <w:t xml:space="preserve">Teen assisted access</w:t>
-      </w:r>
-      <w:r>
-        <w:t xml:space="preserve"> </w:t>
-      </w:r>
-      <w:r>
-        <w:t xml:space="preserve">— May a minor (say 13+)</w:t>
-      </w:r>
-      <w:r>
-        <w:t xml:space="preserve"> </w:t>
-      </w:r>
-      <w:r>
-        <w:rPr>
-          <w:i/>
-          <w:iCs/>
-        </w:rPr>
-        <w:t xml:space="preserve">view/use</w:t>
-      </w:r>
-      <w:r>
-        <w:t xml:space="preserve"> </w:t>
-      </w:r>
-      <w:r>
-        <w:t xml:space="preserve">their branch under guardian oversight before 18, while the guardian retains ownership and consent authority? If so, is there a minimum age?</w:t>
-      </w:r>
-      <w:r>
-        <w:t xml:space="preserve"> </w:t>
-      </w:r>
-      <w:r>
-        <w:t xml:space="preserve">3.</w:t>
-      </w:r>
-      <w:r>
-        <w:t xml:space="preserve"> </w:t>
-      </w:r>
-      <w:r>
-        <w:rPr>
-          <w:b/>
-          <w:bCs/>
-        </w:rPr>
-        <w:t xml:space="preserve">Majority handover</w:t>
-      </w:r>
-      <w:r>
-        <w:t xml:space="preserve"> </w:t>
-      </w:r>
-      <w:r>
-        <w:t xml:space="preserve">— At 18, must we obtain the now-adult’s own fresh consent to continue processing the memories accrued during childhood? Any notice/waiting period for the transfer itself?</w:t>
-      </w:r>
-    </w:p>
-    <w:p>
-      <w:pPr>
-        <w:pStyle w:val="BodyText"/>
-      </w:pPr>
-      <w:r>
-        <w:rPr>
-          <w:b/>
-          <w:bCs/>
-        </w:rPr>
-        <w:t xml:space="preserve">Legacy / post-mortem</w:t>
-      </w:r>
-      <w:r>
-        <w:t xml:space="preserve"> </w:t>
-      </w:r>
-      <w:r>
-        <w:t xml:space="preserve">4.</w:t>
-      </w:r>
-      <w:r>
-        <w:t xml:space="preserve"> </w:t>
-      </w:r>
-      <w:r>
-        <w:rPr>
-          <w:b/>
-          <w:bCs/>
-        </w:rPr>
-        <w:t xml:space="preserve">Post-mortem data</w:t>
-      </w:r>
-      <w:r>
-        <w:t xml:space="preserve"> </w:t>
-      </w:r>
-      <w:r>
-        <w:t xml:space="preserve">— Does RA 10173 (or other PH law) govern a deceased person’s personal data, and who may control it after death? Any constraints on treating memories as inheritable?</w:t>
-      </w:r>
-      <w:r>
-        <w:t xml:space="preserve"> </w:t>
-      </w:r>
-      <w:r>
-        <w:t xml:space="preserve">5.</w:t>
-      </w:r>
-      <w:r>
-        <w:t xml:space="preserve"> </w:t>
-      </w:r>
-      <w:r>
-        <w:rPr>
-          <w:b/>
-          <w:bCs/>
-        </w:rPr>
-        <w:t xml:space="preserve">Proof to inherit</w:t>
-      </w:r>
-      <w:r>
-        <w:t xml:space="preserve"> </w:t>
-      </w:r>
-      <w:r>
-        <w:t xml:space="preserve">— What proof of death, and what proof of a direct-line heir’s authority, should we require before an inheritance transfer? Is</w:t>
-      </w:r>
-      <w:r>
-        <w:t xml:space="preserve"> </w:t>
-      </w:r>
-      <w:r>
-        <w:rPr>
-          <w:b/>
-          <w:bCs/>
-        </w:rPr>
-        <w:t xml:space="preserve">memorial-by-default</w:t>
-      </w:r>
-      <w:r>
-        <w:t xml:space="preserve"> </w:t>
-      </w:r>
-      <w:r>
-        <w:t xml:space="preserve">(read-only) the right posture until that proof exists?</w:t>
-      </w:r>
-      <w:r>
-        <w:t xml:space="preserve"> </w:t>
-      </w:r>
-      <w:r>
-        <w:t xml:space="preserve">6.</w:t>
-      </w:r>
-      <w:r>
-        <w:t xml:space="preserve"> </w:t>
-      </w:r>
-      <w:r>
-        <w:rPr>
-          <w:b/>
-          <w:bCs/>
-        </w:rPr>
-        <w:t xml:space="preserve">Pre-designation</w:t>
-      </w:r>
-      <w:r>
-        <w:t xml:space="preserve"> </w:t>
-      </w:r>
-      <w:r>
-        <w:t xml:space="preserve">— May a living person validly designate, in-app, who inherits their memories (a directive we’d honor at death), and how binding is that against other heirs?</w:t>
-      </w:r>
-    </w:p>
-    <w:p>
-      <w:pPr>
-        <w:pStyle w:val="BodyText"/>
-      </w:pPr>
-      <w:r>
-        <w:rPr>
-          <w:b/>
-          <w:bCs/>
-        </w:rPr>
-        <w:t xml:space="preserve">Cross-cutting</w:t>
-      </w:r>
-      <w:r>
-        <w:t xml:space="preserve"> </w:t>
-      </w:r>
-      <w:r>
-        <w:t xml:space="preserve">7.</w:t>
-      </w:r>
-      <w:r>
-        <w:t xml:space="preserve"> </w:t>
-      </w:r>
-      <w:r>
-        <w:rPr>
-          <w:b/>
-          <w:bCs/>
-        </w:rPr>
-        <w:t xml:space="preserve">Verification + reversal</w:t>
-      </w:r>
-      <w:r>
-        <w:t xml:space="preserve"> </w:t>
-      </w:r>
-      <w:r>
-        <w:t xml:space="preserve">— What identity-verification bar should gate</w:t>
-      </w:r>
-      <w:r>
-        <w:t xml:space="preserve"> </w:t>
-      </w:r>
-      <w:r>
-        <w:rPr>
-          <w:i/>
-          <w:iCs/>
-        </w:rPr>
-        <w:t xml:space="preserve">any</w:t>
-      </w:r>
-      <w:r>
-        <w:t xml:space="preserve"> </w:t>
-      </w:r>
-      <w:r>
-        <w:t xml:space="preserve">ownership transfer, and what is the compliant path to reverse a wrongful transfer?</w:t>
-      </w:r>
-    </w:p>
-    <w:bookmarkEnd w:id="12"/>
-    <w:bookmarkStart w:id="13" w:name="what-is-explicitly-not-in-this-review"/>
-    <w:p>
-      <w:pPr>
-        <w:pStyle w:val="Heading2"/>
-      </w:pPr>
-      <w:r>
-        <w:t xml:space="preserve">5. What is explicitly NOT in this review</w:t>
-      </w:r>
-    </w:p>
-    <w:p>
-      <w:pPr>
-        <w:pStyle w:val="Compact"/>
         <w:numPr>
           <w:ilvl w:val="0"/>
           <w:numId w:val="1002"/>
@@ -998,18 +814,71 @@
           <w:b/>
           <w:bCs/>
         </w:rPr>
-        <w:t xml:space="preserve">No biometric / facial recognition</w:t>
-      </w:r>
-      <w:r>
-        <w:t xml:space="preserve"> </w:t>
-      </w:r>
-      <w:r>
-        <w:t xml:space="preserve">(as in Phase 2; any future on-device face feature gets its own DPIA).</w:t>
-      </w:r>
-    </w:p>
-    <w:p>
-      <w:pPr>
-        <w:pStyle w:val="Compact"/>
+        <w:t xml:space="preserve">Ownership transfers at age of majority (18).</w:t>
+      </w:r>
+      <w:r>
+        <w:t xml:space="preserve"> </w:t>
+      </w:r>
+      <w:r>
+        <w:t xml:space="preserve">The guardian is the lawful decision-maker for the child’s data until 18; at 18 ownership + consent authority transfer to the person. We are</w:t>
+      </w:r>
+      <w:r>
+        <w:t xml:space="preserve"> </w:t>
+      </w:r>
+      <w:r>
+        <w:rPr>
+          <w:b/>
+          <w:bCs/>
+        </w:rPr>
+        <w:t xml:space="preserve">not</w:t>
+      </w:r>
+      <w:r>
+        <w:t xml:space="preserve"> </w:t>
+      </w:r>
+      <w:r>
+        <w:t xml:space="preserve">promising any sub-18 ownership transfer.</w:t>
+      </w:r>
+      <w:r>
+        <w:t xml:space="preserve"> </w:t>
+      </w:r>
+      <w:r>
+        <w:rPr>
+          <w:i/>
+          <w:iCs/>
+        </w:rPr>
+        <w:t xml:space="preserve">(We considered an optional teen</w:t>
+      </w:r>
+      <w:r>
+        <w:rPr>
+          <w:i/>
+          <w:iCs/>
+        </w:rPr>
+        <w:t xml:space="preserve"> </w:t>
+      </w:r>
+      <w:r>
+        <w:rPr>
+          <w:i/>
+          <w:iCs/>
+        </w:rPr>
+        <w:t xml:space="preserve">“assisted access”</w:t>
+      </w:r>
+      <w:r>
+        <w:rPr>
+          <w:i/>
+          <w:iCs/>
+        </w:rPr>
+        <w:t xml:space="preserve"> </w:t>
+      </w:r>
+      <w:r>
+        <w:rPr>
+          <w:i/>
+          <w:iCs/>
+        </w:rPr>
+        <w:t xml:space="preserve">— view-only use under guardian oversight, guardian keeps ownership/consent — see Q2.)</w:t>
+      </w:r>
+    </w:p>
+    <w:p>
+      <w:pPr>
         <w:numPr>
           <w:ilvl w:val="0"/>
           <w:numId w:val="1002"/>
@@ -1020,18 +889,17 @@
           <w:b/>
           <w:bCs/>
         </w:rPr>
-        <w:t xml:space="preserve">No pricing/payment</w:t>
-      </w:r>
-      <w:r>
-        <w:t xml:space="preserve"> </w:t>
-      </w:r>
-      <w:r>
-        <w:t xml:space="preserve">decision (preservation is free; a premium vault is a separate commercial matter).</w:t>
-      </w:r>
-    </w:p>
-    <w:p>
-      <w:pPr>
-        <w:pStyle w:val="Compact"/>
+        <w:t xml:space="preserve">Guardian is steward until majority.</w:t>
+      </w:r>
+      <w:r>
+        <w:t xml:space="preserve"> </w:t>
+      </w:r>
+      <w:r>
+        <w:t xml:space="preserve">Memories accrue on the child’s node throughout 0–18, managed by the guardian.</w:t>
+      </w:r>
+    </w:p>
+    <w:p>
+      <w:pPr>
         <w:numPr>
           <w:ilvl w:val="0"/>
           <w:numId w:val="1002"/>
@@ -1042,6 +910,812 @@
           <w:b/>
           <w:bCs/>
         </w:rPr>
+        <w:t xml:space="preserve">Legacy passes down the DIRECT LINE only</w:t>
+      </w:r>
+      <w:r>
+        <w:t xml:space="preserve"> </w:t>
+      </w:r>
+      <w:r>
+        <w:t xml:space="preserve">— child → grandchild → … — never sideways (no siblings/cousins), using confirmed parent/child relationships.</w:t>
+      </w:r>
+    </w:p>
+    <w:p>
+      <w:pPr>
+        <w:numPr>
+          <w:ilvl w:val="0"/>
+          <w:numId w:val="1002"/>
+        </w:numPr>
+      </w:pPr>
+      <w:r>
+        <w:t xml:space="preserve">🔴</w:t>
+      </w:r>
+      <w:r>
+        <w:t xml:space="preserve"> </w:t>
+      </w:r>
+      <w:r>
+        <w:rPr>
+          <w:b/>
+          <w:bCs/>
+        </w:rPr>
+        <w:t xml:space="preserve">CORRECTED 2026-07-30 — PRESERVATION IS PAID.</w:t>
+      </w:r>
+      <w:r>
+        <w:t xml:space="preserve"> </w:t>
+      </w:r>
+      <w:r>
+        <w:rPr>
+          <w:i/>
+          <w:iCs/>
+          <w:strike/>
+        </w:rPr>
+        <w:t xml:space="preserve">Preservation is free; we only charge for enhancement. We will not charge a fee to prevent loss of a deceased person’s memories. (A premium</w:t>
+      </w:r>
+      <w:r>
+        <w:rPr>
+          <w:i/>
+          <w:iCs/>
+          <w:strike/>
+        </w:rPr>
+        <w:t xml:space="preserve"> </w:t>
+      </w:r>
+      <w:r>
+        <w:rPr>
+          <w:i/>
+          <w:iCs/>
+          <w:strike/>
+        </w:rPr>
+        <w:t xml:space="preserve">“vault”</w:t>
+      </w:r>
+      <w:r>
+        <w:rPr>
+          <w:i/>
+          <w:iCs/>
+          <w:strike/>
+        </w:rPr>
+        <w:t xml:space="preserve"> </w:t>
+      </w:r>
+      <w:r>
+        <w:rPr>
+          <w:i/>
+          <w:iCs/>
+          <w:strike/>
+        </w:rPr>
+        <w:t xml:space="preserve">of extra features may be paid — not relevant to this review.)</w:t>
+      </w:r>
+      <w:r>
+        <w:t xml:space="preserve"> </w:t>
+      </w:r>
+      <w:r>
+        <w:rPr>
+          <w:b/>
+          <w:bCs/>
+        </w:rPr>
+        <w:t xml:space="preserve">The current model:</w:t>
+      </w:r>
+      <w:r>
+        <w:t xml:space="preserve"> </w:t>
+      </w:r>
+      <w:r>
+        <w:t xml:space="preserve">keeping a deceased relative’s memories is a</w:t>
+      </w:r>
+      <w:r>
+        <w:t xml:space="preserve"> </w:t>
+      </w:r>
+      <w:r>
+        <w:rPr>
+          <w:b/>
+          <w:bCs/>
+        </w:rPr>
+        <w:t xml:space="preserve">recurring paid service</w:t>
+      </w:r>
+      <w:r>
+        <w:t xml:space="preserve">, charged to</w:t>
+      </w:r>
+      <w:r>
+        <w:t xml:space="preserve"> </w:t>
+      </w:r>
+      <w:r>
+        <w:rPr>
+          <w:b/>
+          <w:bCs/>
+        </w:rPr>
+        <w:t xml:space="preserve">each</w:t>
+      </w:r>
+      <w:r>
+        <w:t xml:space="preserve"> </w:t>
+      </w:r>
+      <w:r>
+        <w:t xml:space="preserve">account that holds them. Where several descendants each hold a copy, each pays separately.</w:t>
+      </w:r>
+      <w:r>
+        <w:t xml:space="preserve"> </w:t>
+      </w:r>
+      <w:r>
+        <w:rPr>
+          <w:b/>
+          <w:bCs/>
+        </w:rPr>
+        <w:t xml:space="preserve">If a payer lapses, that account’s copy of the memories is discontinued.</w:t>
+      </w:r>
+      <w:r>
+        <w:t xml:space="preserve"> </w:t>
+      </w:r>
+      <w:r>
+        <w:t xml:space="preserve">We have not yet fixed the price, the billing period, the grace period, or whether a lapse deletes the data outright or degrades it to a lower-quality retained copy —</w:t>
+      </w:r>
+      <w:r>
+        <w:t xml:space="preserve"> </w:t>
+      </w:r>
+      <w:r>
+        <w:rPr>
+          <w:b/>
+          <w:bCs/>
+        </w:rPr>
+        <w:t xml:space="preserve">your answer to § 4 Q8 will shape that choice</w:t>
+      </w:r>
+      <w:r>
+        <w:t xml:space="preserve">, which is why we are asking before we build.</w:t>
+      </w:r>
+    </w:p>
+    <w:p>
+      <w:pPr>
+        <w:numPr>
+          <w:ilvl w:val="0"/>
+          <w:numId w:val="1002"/>
+        </w:numPr>
+      </w:pPr>
+      <w:r>
+        <w:t xml:space="preserve">🆕</w:t>
+      </w:r>
+      <w:r>
+        <w:t xml:space="preserve"> </w:t>
+      </w:r>
+      <w:r>
+        <w:rPr>
+          <w:b/>
+          <w:bCs/>
+        </w:rPr>
+        <w:t xml:space="preserve">ADDED 2026-07-30 — one deceased person, several holders.</w:t>
+      </w:r>
+      <w:r>
+        <w:t xml:space="preserve"> </w:t>
+      </w:r>
+      <w:r>
+        <w:t xml:space="preserve">On death the person’s page becomes a</w:t>
+      </w:r>
+      <w:r>
+        <w:t xml:space="preserve"> </w:t>
+      </w:r>
+      <w:r>
+        <w:rPr>
+          <w:b/>
+          <w:bCs/>
+        </w:rPr>
+        <w:t xml:space="preserve">memorial that remains under their own name and identity</w:t>
+      </w:r>
+      <w:r>
+        <w:t xml:space="preserve"> </w:t>
+      </w:r>
+      <w:r>
+        <w:t xml:space="preserve">(it is not renamed or absorbed into a survivor’s account), with a direct-line relative as its</w:t>
+      </w:r>
+      <w:r>
+        <w:t xml:space="preserve"> </w:t>
+      </w:r>
+      <w:r>
+        <w:rPr>
+          <w:i/>
+          <w:iCs/>
+        </w:rPr>
+        <w:t xml:space="preserve">keeper</w:t>
+      </w:r>
+      <w:r>
+        <w:t xml:space="preserve">.</w:t>
+      </w:r>
+      <w:r>
+        <w:t xml:space="preserve"> </w:t>
+      </w:r>
+      <w:r>
+        <w:rPr>
+          <w:b/>
+          <w:bCs/>
+        </w:rPr>
+        <w:t xml:space="preserve">In addition</w:t>
+      </w:r>
+      <w:r>
+        <w:t xml:space="preserve">, each direct-line child may hold a personally-curated copy of the ancestral memories inside their own account. Copies pass</w:t>
+      </w:r>
+      <w:r>
+        <w:t xml:space="preserve"> </w:t>
+      </w:r>
+      <w:r>
+        <w:rPr>
+          <w:b/>
+          <w:bCs/>
+        </w:rPr>
+        <w:t xml:space="preserve">down the direct line only</w:t>
+      </w:r>
+      <w:r>
+        <w:t xml:space="preserve"> </w:t>
+      </w:r>
+      <w:r>
+        <w:t xml:space="preserve">— never to siblings of the deceased, cousins, or in-laws.</w:t>
+      </w:r>
+    </w:p>
+    <w:bookmarkEnd w:id="12"/>
+    <w:bookmarkStart w:id="13" w:name="the-specific-questions-we-need-answered"/>
+    <w:p>
+      <w:pPr>
+        <w:pStyle w:val="Heading2"/>
+      </w:pPr>
+      <w:r>
+        <w:t xml:space="preserve">4. The specific questions we need answered</w:t>
+      </w:r>
+    </w:p>
+    <w:p>
+      <w:pPr>
+        <w:pStyle w:val="FirstParagraph"/>
+      </w:pPr>
+      <w:r>
+        <w:rPr>
+          <w:b/>
+          <w:bCs/>
+        </w:rPr>
+        <w:t xml:space="preserve">Minors</w:t>
+      </w:r>
+      <w:r>
+        <w:t xml:space="preserve"> </w:t>
+      </w:r>
+      <w:r>
+        <w:t xml:space="preserve">1.</w:t>
+      </w:r>
+      <w:r>
+        <w:t xml:space="preserve"> </w:t>
+      </w:r>
+      <w:r>
+        <w:rPr>
+          <w:b/>
+          <w:bCs/>
+        </w:rPr>
+        <w:t xml:space="preserve">Guardianship + consent</w:t>
+      </w:r>
+      <w:r>
+        <w:t xml:space="preserve"> </w:t>
+      </w:r>
+      <w:r>
+        <w:t xml:space="preserve">— What standard should we require to prove a person is a child’s parent/legal guardian, and what may a guardian consent to on the child’s behalf regarding this data?</w:t>
+      </w:r>
+      <w:r>
+        <w:t xml:space="preserve"> </w:t>
+      </w:r>
+      <w:r>
+        <w:t xml:space="preserve">2.</w:t>
+      </w:r>
+      <w:r>
+        <w:t xml:space="preserve"> </w:t>
+      </w:r>
+      <w:r>
+        <w:rPr>
+          <w:b/>
+          <w:bCs/>
+        </w:rPr>
+        <w:t xml:space="preserve">Teen assisted access</w:t>
+      </w:r>
+      <w:r>
+        <w:t xml:space="preserve"> </w:t>
+      </w:r>
+      <w:r>
+        <w:t xml:space="preserve">— May a minor (say 13+)</w:t>
+      </w:r>
+      <w:r>
+        <w:t xml:space="preserve"> </w:t>
+      </w:r>
+      <w:r>
+        <w:rPr>
+          <w:i/>
+          <w:iCs/>
+        </w:rPr>
+        <w:t xml:space="preserve">view/use</w:t>
+      </w:r>
+      <w:r>
+        <w:t xml:space="preserve"> </w:t>
+      </w:r>
+      <w:r>
+        <w:t xml:space="preserve">their branch under guardian oversight before 18, while the guardian retains ownership and consent authority? If so, is there a minimum age?</w:t>
+      </w:r>
+      <w:r>
+        <w:t xml:space="preserve"> </w:t>
+      </w:r>
+      <w:r>
+        <w:t xml:space="preserve">3.</w:t>
+      </w:r>
+      <w:r>
+        <w:t xml:space="preserve"> </w:t>
+      </w:r>
+      <w:r>
+        <w:rPr>
+          <w:b/>
+          <w:bCs/>
+        </w:rPr>
+        <w:t xml:space="preserve">Majority handover</w:t>
+      </w:r>
+      <w:r>
+        <w:t xml:space="preserve"> </w:t>
+      </w:r>
+      <w:r>
+        <w:t xml:space="preserve">— At 18, must we obtain the now-adult’s own fresh consent to continue processing the memories accrued during childhood? Any notice/waiting period for the transfer itself?</w:t>
+      </w:r>
+    </w:p>
+    <w:p>
+      <w:pPr>
+        <w:pStyle w:val="BodyText"/>
+      </w:pPr>
+      <w:r>
+        <w:rPr>
+          <w:b/>
+          <w:bCs/>
+        </w:rPr>
+        <w:t xml:space="preserve">Legacy / post-mortem</w:t>
+      </w:r>
+      <w:r>
+        <w:t xml:space="preserve"> </w:t>
+      </w:r>
+      <w:r>
+        <w:t xml:space="preserve">4.</w:t>
+      </w:r>
+      <w:r>
+        <w:t xml:space="preserve"> </w:t>
+      </w:r>
+      <w:r>
+        <w:rPr>
+          <w:b/>
+          <w:bCs/>
+        </w:rPr>
+        <w:t xml:space="preserve">Post-mortem data</w:t>
+      </w:r>
+      <w:r>
+        <w:t xml:space="preserve"> </w:t>
+      </w:r>
+      <w:r>
+        <w:t xml:space="preserve">— Does RA 10173 (or other PH law) govern a deceased person’s personal data, and who may control it after death? Any constraints on treating memories as inheritable?</w:t>
+      </w:r>
+      <w:r>
+        <w:t xml:space="preserve"> </w:t>
+      </w:r>
+      <w:r>
+        <w:t xml:space="preserve">5.</w:t>
+      </w:r>
+      <w:r>
+        <w:t xml:space="preserve"> </w:t>
+      </w:r>
+      <w:r>
+        <w:rPr>
+          <w:b/>
+          <w:bCs/>
+        </w:rPr>
+        <w:t xml:space="preserve">Proof to inherit</w:t>
+      </w:r>
+      <w:r>
+        <w:t xml:space="preserve"> </w:t>
+      </w:r>
+      <w:r>
+        <w:t xml:space="preserve">— What proof of death, and what proof of a direct-line heir’s authority, should we require before an inheritance transfer? Is</w:t>
+      </w:r>
+      <w:r>
+        <w:t xml:space="preserve"> </w:t>
+      </w:r>
+      <w:r>
+        <w:rPr>
+          <w:b/>
+          <w:bCs/>
+        </w:rPr>
+        <w:t xml:space="preserve">memorial-by-default</w:t>
+      </w:r>
+      <w:r>
+        <w:t xml:space="preserve"> </w:t>
+      </w:r>
+      <w:r>
+        <w:t xml:space="preserve">(read-only) the right posture until that proof exists?</w:t>
+      </w:r>
+      <w:r>
+        <w:t xml:space="preserve"> </w:t>
+      </w:r>
+      <w:r>
+        <w:t xml:space="preserve">6.</w:t>
+      </w:r>
+      <w:r>
+        <w:t xml:space="preserve"> </w:t>
+      </w:r>
+      <w:r>
+        <w:rPr>
+          <w:b/>
+          <w:bCs/>
+        </w:rPr>
+        <w:t xml:space="preserve">Pre-designation</w:t>
+      </w:r>
+      <w:r>
+        <w:t xml:space="preserve"> </w:t>
+      </w:r>
+      <w:r>
+        <w:t xml:space="preserve">— May a living person validly designate, in-app, who inherits their memories (a directive we’d honor at death), and how binding is that against other heirs?</w:t>
+      </w:r>
+    </w:p>
+    <w:p>
+      <w:pPr>
+        <w:pStyle w:val="BodyText"/>
+      </w:pPr>
+      <w:r>
+        <w:rPr>
+          <w:b/>
+          <w:bCs/>
+        </w:rPr>
+        <w:t xml:space="preserve">Cross-cutting</w:t>
+      </w:r>
+      <w:r>
+        <w:t xml:space="preserve"> </w:t>
+      </w:r>
+      <w:r>
+        <w:t xml:space="preserve">7.</w:t>
+      </w:r>
+      <w:r>
+        <w:t xml:space="preserve"> </w:t>
+      </w:r>
+      <w:r>
+        <w:rPr>
+          <w:b/>
+          <w:bCs/>
+        </w:rPr>
+        <w:t xml:space="preserve">Verification + reversal</w:t>
+      </w:r>
+      <w:r>
+        <w:t xml:space="preserve"> </w:t>
+      </w:r>
+      <w:r>
+        <w:t xml:space="preserve">— What identity-verification bar should gate</w:t>
+      </w:r>
+      <w:r>
+        <w:t xml:space="preserve"> </w:t>
+      </w:r>
+      <w:r>
+        <w:rPr>
+          <w:i/>
+          <w:iCs/>
+        </w:rPr>
+        <w:t xml:space="preserve">any</w:t>
+      </w:r>
+      <w:r>
+        <w:t xml:space="preserve"> </w:t>
+      </w:r>
+      <w:r>
+        <w:t xml:space="preserve">ownership transfer, and what is the compliant path to reverse a wrongful transfer?</w:t>
+      </w:r>
+    </w:p>
+    <w:p>
+      <w:pPr>
+        <w:pStyle w:val="BodyText"/>
+      </w:pPr>
+      <w:r>
+        <w:rPr>
+          <w:b/>
+          <w:bCs/>
+        </w:rPr>
+        <w:t xml:space="preserve">🆕 Added 2026-07-30 — the paid-preservation model (please treat these as the priority questions)</w:t>
+      </w:r>
+    </w:p>
+    <w:p>
+      <w:pPr>
+        <w:pStyle w:val="Compact"/>
+        <w:numPr>
+          <w:ilvl w:val="0"/>
+          <w:numId w:val="1003"/>
+        </w:numPr>
+      </w:pPr>
+      <w:r>
+        <w:rPr>
+          <w:b/>
+          <w:bCs/>
+        </w:rPr>
+        <w:t xml:space="preserve">Deletion for non-payment.</w:t>
+      </w:r>
+      <w:r>
+        <w:t xml:space="preserve"> </w:t>
+      </w:r>
+      <w:r>
+        <w:t xml:space="preserve">Where a living survivor pays a recurring fee to preserve a</w:t>
+      </w:r>
+      <w:r>
+        <w:t xml:space="preserve"> </w:t>
+      </w:r>
+      <w:r>
+        <w:rPr>
+          <w:b/>
+          <w:bCs/>
+        </w:rPr>
+        <w:t xml:space="preserve">deceased</w:t>
+      </w:r>
+      <w:r>
+        <w:t xml:space="preserve"> </w:t>
+      </w:r>
+      <w:r>
+        <w:t xml:space="preserve">relative’s memories,</w:t>
+      </w:r>
+      <w:r>
+        <w:t xml:space="preserve"> </w:t>
+      </w:r>
+      <w:r>
+        <w:rPr>
+          <w:b/>
+          <w:bCs/>
+        </w:rPr>
+        <w:t xml:space="preserve">may we lawfully delete that data when the payment lapses?</w:t>
+      </w:r>
+      <w:r>
+        <w:t xml:space="preserve"> </w:t>
+      </w:r>
+      <w:r>
+        <w:t xml:space="preserve">Specifically: (a) does the deceased, their estate, or a direct-line heir hold any interest in that data that</w:t>
+      </w:r>
+      <w:r>
+        <w:t xml:space="preserve"> </w:t>
+      </w:r>
+      <w:r>
+        <w:rPr>
+          <w:i/>
+          <w:iCs/>
+        </w:rPr>
+        <w:t xml:space="preserve">survives</w:t>
+      </w:r>
+      <w:r>
+        <w:t xml:space="preserve"> </w:t>
+      </w:r>
+      <w:r>
+        <w:t xml:space="preserve">the lapse and constrains our ability to delete it; (b) what notice and grace period should precede deletion; (c) is there any exposure in</w:t>
+      </w:r>
+      <w:r>
+        <w:t xml:space="preserve"> </w:t>
+      </w:r>
+      <w:r>
+        <w:rPr>
+          <w:i/>
+          <w:iCs/>
+        </w:rPr>
+        <w:t xml:space="preserve">charging</w:t>
+      </w:r>
+      <w:r>
+        <w:t xml:space="preserve"> </w:t>
+      </w:r>
+      <w:r>
+        <w:t xml:space="preserve">for the continued existence of a deceased person’s data at all; and (d) would you advise a different lapse behaviour — for example degrading to a lower-resolution retained copy rather than deleting — to reduce that exposure?</w:t>
+      </w:r>
+    </w:p>
+    <w:p>
+      <w:pPr>
+        <w:pStyle w:val="Compact"/>
+        <w:numPr>
+          <w:ilvl w:val="0"/>
+          <w:numId w:val="1003"/>
+        </w:numPr>
+      </w:pPr>
+      <w:r>
+        <w:rPr>
+          <w:b/>
+          <w:bCs/>
+        </w:rPr>
+        <w:t xml:space="preserve">Several holders of one deceased person’s data.</w:t>
+      </w:r>
+      <w:r>
+        <w:t xml:space="preserve"> </w:t>
+      </w:r>
+      <w:r>
+        <w:t xml:space="preserve">Where the same deceased person’s memories exist as a canonical memorial</w:t>
+      </w:r>
+      <w:r>
+        <w:t xml:space="preserve"> </w:t>
+      </w:r>
+      <w:r>
+        <w:rPr>
+          <w:b/>
+          <w:bCs/>
+        </w:rPr>
+        <w:t xml:space="preserve">and</w:t>
+      </w:r>
+      <w:r>
+        <w:t xml:space="preserve"> </w:t>
+      </w:r>
+      <w:r>
+        <w:t xml:space="preserve">as personal copies in several descendants’ accounts: (a) what must we do so that an erasure, takedown, or objection reaches</w:t>
+      </w:r>
+      <w:r>
+        <w:t xml:space="preserve"> </w:t>
+      </w:r>
+      <w:r>
+        <w:rPr>
+          <w:b/>
+          <w:bCs/>
+        </w:rPr>
+        <w:t xml:space="preserve">every</w:t>
+      </w:r>
+      <w:r>
+        <w:t xml:space="preserve"> </w:t>
+      </w:r>
+      <w:r>
+        <w:t xml:space="preserve">copy; (b) does one holder’s lapse or deletion affect the others; and (c) does holding multiple copies change our obligations compared with a single memorial record?</w:t>
+      </w:r>
+      <w:r>
+        <w:t xml:space="preserve"> </w:t>
+      </w:r>
+      <w:r>
+        <w:rPr>
+          <w:i/>
+          <w:iCs/>
+        </w:rPr>
+        <w:t xml:space="preserve">(Our engineering intent is to implement</w:t>
+      </w:r>
+      <w:r>
+        <w:rPr>
+          <w:i/>
+          <w:iCs/>
+        </w:rPr>
+        <w:t xml:space="preserve"> </w:t>
+      </w:r>
+      <w:r>
+        <w:rPr>
+          <w:i/>
+          <w:iCs/>
+        </w:rPr>
+        <w:t xml:space="preserve">“copies”</w:t>
+      </w:r>
+      <w:r>
+        <w:rPr>
+          <w:i/>
+          <w:iCs/>
+        </w:rPr>
+        <w:t xml:space="preserve"> </w:t>
+      </w:r>
+      <w:r>
+        <w:rPr>
+          <w:i/>
+          <w:iCs/>
+        </w:rPr>
+        <w:t xml:space="preserve">as per-person views over one underlying record rather than duplicated data, precisely so an erasure is enforceable — we would welcome your view on whether that is sufficient.)</w:t>
+      </w:r>
+    </w:p>
+    <w:bookmarkEnd w:id="13"/>
+    <w:bookmarkStart w:id="14" w:name="what-is-explicitly-not-in-this-review"/>
+    <w:p>
+      <w:pPr>
+        <w:pStyle w:val="Heading2"/>
+      </w:pPr>
+      <w:r>
+        <w:t xml:space="preserve">5. What is explicitly NOT in this review</w:t>
+      </w:r>
+    </w:p>
+    <w:p>
+      <w:pPr>
+        <w:pStyle w:val="Compact"/>
+        <w:numPr>
+          <w:ilvl w:val="0"/>
+          <w:numId w:val="1004"/>
+        </w:numPr>
+      </w:pPr>
+      <w:r>
+        <w:rPr>
+          <w:b/>
+          <w:bCs/>
+        </w:rPr>
+        <w:t xml:space="preserve">No biometric / facial recognition</w:t>
+      </w:r>
+      <w:r>
+        <w:t xml:space="preserve"> </w:t>
+      </w:r>
+      <w:r>
+        <w:t xml:space="preserve">(as in Phase 2; any future on-device face feature gets its own DPIA).</w:t>
+      </w:r>
+    </w:p>
+    <w:p>
+      <w:pPr>
+        <w:pStyle w:val="Compact"/>
+        <w:numPr>
+          <w:ilvl w:val="0"/>
+          <w:numId w:val="1004"/>
+        </w:numPr>
+      </w:pPr>
+      <w:r>
+        <w:t xml:space="preserve">🔴</w:t>
+      </w:r>
+      <w:r>
+        <w:t xml:space="preserve"> </w:t>
+      </w:r>
+      <w:r>
+        <w:rPr>
+          <w:b/>
+          <w:bCs/>
+        </w:rPr>
+        <w:t xml:space="preserve">CORRECTED 2026-07-30.</w:t>
+      </w:r>
+      <w:r>
+        <w:t xml:space="preserve"> </w:t>
+      </w:r>
+      <w:r>
+        <w:rPr>
+          <w:i/>
+          <w:iCs/>
+          <w:strike/>
+        </w:rPr>
+        <w:t xml:space="preserve">No pricing/payment decision (preservation is free; a premium vault is a separate commercial matter).</w:t>
+      </w:r>
+      <w:r>
+        <w:t xml:space="preserve"> </w:t>
+      </w:r>
+      <w:r>
+        <w:rPr>
+          <w:b/>
+          <w:bCs/>
+        </w:rPr>
+        <w:t xml:space="preserve">Payment is now squarely in scope</w:t>
+      </w:r>
+      <w:r>
+        <w:t xml:space="preserve">, because the commercial model reversed: preservation of a deceased person’s memories is a</w:t>
+      </w:r>
+      <w:r>
+        <w:t xml:space="preserve"> </w:t>
+      </w:r>
+      <w:r>
+        <w:rPr>
+          <w:b/>
+          <w:bCs/>
+        </w:rPr>
+        <w:t xml:space="preserve">paid recurring service</w:t>
+      </w:r>
+      <w:r>
+        <w:t xml:space="preserve"> </w:t>
+      </w:r>
+      <w:r>
+        <w:t xml:space="preserve">and lapse ends it (§ 3.4 as corrected). We are</w:t>
+      </w:r>
+      <w:r>
+        <w:t xml:space="preserve"> </w:t>
+      </w:r>
+      <w:r>
+        <w:rPr>
+          <w:b/>
+          <w:bCs/>
+        </w:rPr>
+        <w:t xml:space="preserve">not</w:t>
+      </w:r>
+      <w:r>
+        <w:t xml:space="preserve"> </w:t>
+      </w:r>
+      <w:r>
+        <w:t xml:space="preserve">asking you to price it — we are asking, in</w:t>
+      </w:r>
+      <w:r>
+        <w:t xml:space="preserve"> </w:t>
+      </w:r>
+      <w:r>
+        <w:rPr>
+          <w:b/>
+          <w:bCs/>
+        </w:rPr>
+        <w:t xml:space="preserve">§ 4 Q8</w:t>
+      </w:r>
+      <w:r>
+        <w:t xml:space="preserve">, whether the model is lawful and what it obliges us to do. The specific price and billing period remain a commercial matter outside this review.</w:t>
+      </w:r>
+    </w:p>
+    <w:p>
+      <w:pPr>
+        <w:pStyle w:val="Compact"/>
+        <w:numPr>
+          <w:ilvl w:val="0"/>
+          <w:numId w:val="1004"/>
+        </w:numPr>
+      </w:pPr>
+      <w:r>
+        <w:rPr>
+          <w:b/>
+          <w:bCs/>
+        </w:rPr>
         <w:t xml:space="preserve">Nothing is built</w:t>
       </w:r>
       <w:r>
@@ -1050,9 +1724,19 @@
       <w:r>
         <w:t xml:space="preserve">— we will scaffold only empty, inert structures until you clear the model.</w:t>
       </w:r>
-    </w:p>
-    <w:bookmarkEnd w:id="13"/>
-    <w:bookmarkStart w:id="14" w:name="what-were-asking-for"/>
+      <w:r>
+        <w:t xml:space="preserve"> </w:t>
+      </w:r>
+      <w:r>
+        <w:rPr>
+          <w:i/>
+          <w:iCs/>
+        </w:rPr>
+        <w:t xml:space="preserve">(Status 2026-07-30: this remains true. The only thing that has shipped is an empty, deny-by-default database table holding no data and creating no behaviour.)</w:t>
+      </w:r>
+    </w:p>
+    <w:bookmarkEnd w:id="14"/>
+    <w:bookmarkStart w:id="15" w:name="what-were-asking-for"/>
     <w:p>
       <w:pPr>
         <w:pStyle w:val="Heading2"/>
@@ -1104,8 +1788,8 @@
         <w:t xml:space="preserve">Plain-language brief; the underlying design, schema, and audit model can be walked through with a technical reviewer on request.</w:t>
       </w:r>
     </w:p>
-    <w:bookmarkEnd w:id="14"/>
     <w:bookmarkEnd w:id="15"/>
+    <w:bookmarkEnd w:id="16"/>
     <w:sectPr>
       <w:footnotePr>
         <w:numRestart w:val="eachSect"/>
@@ -1293,6 +1977,91 @@
     </w:lvl>
     <w:lvl w:ilvl="8">
       <w:start w:val="1"/>
+      <w:numFmt w:val="decimal"/>
+      <w:lvlText w:val="%9."/>
+      <w:lvlJc w:val="left"/>
+      <w:pPr>
+        <w:ind w:left="6480" w:hanging="360"/>
+      </w:pPr>
+    </w:lvl>
+  </w:abstractNum>
+  <w:abstractNum w:abstractNumId="99418">
+    <w:nsid w:val="00A99418"/>
+    <w:multiLevelType w:val="multilevel"/>
+    <w:lvl w:ilvl="0">
+      <w:start w:val="8"/>
+      <w:numFmt w:val="decimal"/>
+      <w:lvlText w:val="%1."/>
+      <w:lvlJc w:val="left"/>
+      <w:pPr>
+        <w:ind w:left="720" w:hanging="360"/>
+      </w:pPr>
+    </w:lvl>
+    <w:lvl w:ilvl="1">
+      <w:start w:val="8"/>
+      <w:numFmt w:val="decimal"/>
+      <w:lvlText w:val="%2."/>
+      <w:lvlJc w:val="left"/>
+      <w:pPr>
+        <w:ind w:left="1440" w:hanging="360"/>
+      </w:pPr>
+    </w:lvl>
+    <w:lvl w:ilvl="2">
+      <w:start w:val="8"/>
+      <w:numFmt w:val="decimal"/>
+      <w:lvlText w:val="%3."/>
+      <w:lvlJc w:val="left"/>
+      <w:pPr>
+        <w:ind w:left="2160" w:hanging="360"/>
+      </w:pPr>
+    </w:lvl>
+    <w:lvl w:ilvl="3">
+      <w:start w:val="8"/>
+      <w:numFmt w:val="decimal"/>
+      <w:lvlText w:val="%4."/>
+      <w:lvlJc w:val="left"/>
+      <w:pPr>
+        <w:ind w:left="2880" w:hanging="360"/>
+      </w:pPr>
+    </w:lvl>
+    <w:lvl w:ilvl="4">
+      <w:start w:val="8"/>
+      <w:numFmt w:val="decimal"/>
+      <w:lvlText w:val="%5."/>
+      <w:lvlJc w:val="left"/>
+      <w:pPr>
+        <w:ind w:left="3600" w:hanging="360"/>
+      </w:pPr>
+    </w:lvl>
+    <w:lvl w:ilvl="5">
+      <w:start w:val="8"/>
+      <w:numFmt w:val="decimal"/>
+      <w:lvlText w:val="%6."/>
+      <w:lvlJc w:val="left"/>
+      <w:pPr>
+        <w:ind w:left="4320" w:hanging="360"/>
+      </w:pPr>
+    </w:lvl>
+    <w:lvl w:ilvl="6">
+      <w:start w:val="8"/>
+      <w:numFmt w:val="decimal"/>
+      <w:lvlText w:val="%7."/>
+      <w:lvlJc w:val="left"/>
+      <w:pPr>
+        <w:ind w:left="5040" w:hanging="360"/>
+      </w:pPr>
+    </w:lvl>
+    <w:lvl w:ilvl="7">
+      <w:start w:val="8"/>
+      <w:numFmt w:val="decimal"/>
+      <w:lvlText w:val="%8."/>
+      <w:lvlJc w:val="left"/>
+      <w:pPr>
+        <w:ind w:left="5760" w:hanging="360"/>
+      </w:pPr>
+    </w:lvl>
+    <w:lvl w:ilvl="8">
+      <w:start w:val="8"/>
       <w:numFmt w:val="decimal"/>
       <w:lvlText w:val="%9."/>
       <w:lvlJc w:val="left"/>
@@ -1438,6 +2207,66 @@
     </w:lvlOverride>
   </w:num>
   <w:num w:numId="1002">
+    <w:abstractNumId w:val="99411"/>
+    <w:lvlOverride w:ilvl="0">
+      <w:startOverride w:val="1"/>
+    </w:lvlOverride>
+    <w:lvlOverride w:ilvl="1">
+      <w:startOverride w:val="1"/>
+    </w:lvlOverride>
+    <w:lvlOverride w:ilvl="2">
+      <w:startOverride w:val="1"/>
+    </w:lvlOverride>
+    <w:lvlOverride w:ilvl="3">
+      <w:startOverride w:val="1"/>
+    </w:lvlOverride>
+    <w:lvlOverride w:ilvl="4">
+      <w:startOverride w:val="1"/>
+    </w:lvlOverride>
+    <w:lvlOverride w:ilvl="5">
+      <w:startOverride w:val="1"/>
+    </w:lvlOverride>
+    <w:lvlOverride w:ilvl="6">
+      <w:startOverride w:val="1"/>
+    </w:lvlOverride>
+    <w:lvlOverride w:ilvl="7">
+      <w:startOverride w:val="1"/>
+    </w:lvlOverride>
+    <w:lvlOverride w:ilvl="8">
+      <w:startOverride w:val="1"/>
+    </w:lvlOverride>
+  </w:num>
+  <w:num w:numId="1003">
+    <w:abstractNumId w:val="99418"/>
+    <w:lvlOverride w:ilvl="0">
+      <w:startOverride w:val="8"/>
+    </w:lvlOverride>
+    <w:lvlOverride w:ilvl="1">
+      <w:startOverride w:val="8"/>
+    </w:lvlOverride>
+    <w:lvlOverride w:ilvl="2">
+      <w:startOverride w:val="8"/>
+    </w:lvlOverride>
+    <w:lvlOverride w:ilvl="3">
+      <w:startOverride w:val="8"/>
+    </w:lvlOverride>
+    <w:lvlOverride w:ilvl="4">
+      <w:startOverride w:val="8"/>
+    </w:lvlOverride>
+    <w:lvlOverride w:ilvl="5">
+      <w:startOverride w:val="8"/>
+    </w:lvlOverride>
+    <w:lvlOverride w:ilvl="6">
+      <w:startOverride w:val="8"/>
+    </w:lvlOverride>
+    <w:lvlOverride w:ilvl="7">
+      <w:startOverride w:val="8"/>
+    </w:lvlOverride>
+    <w:lvlOverride w:ilvl="8">
+      <w:startOverride w:val="8"/>
+    </w:lvlOverride>
+  </w:num>
+  <w:num w:numId="1004">
     <w:abstractNumId w:val="991"/>
   </w:num>
 </w:numbering>

</xml_diff>